<commit_message>
Complete initial data exploration and quality assessment
</commit_message>
<xml_diff>
--- a/DA Project - Financial Portfolio Performance Dashboard.docx
+++ b/DA Project - Financial Portfolio Performance Dashboard.docx
@@ -5,6 +5,7 @@
     <w:p>
       <w:pPr>
         <w:pStyle w:val="Title"/>
+        <w:ind w:firstLine="720"/>
         <w:jc w:val="center"/>
       </w:pPr>
       <w:r>
@@ -62,71 +63,89 @@
           <w:i/>
           <w:iCs/>
         </w:rPr>
-        <w:t>This is about the business, not the data.</w:t>
-      </w:r>
+        <w:t xml:space="preserve">This is about </w:t>
+      </w:r>
+      <w:proofErr w:type="gramStart"/>
       <w:r>
         <w:rPr>
           <w:i/>
           <w:iCs/>
         </w:rPr>
-        <w:t xml:space="preserve"> It defines the purpose of the project.]</w:t>
-      </w:r>
-    </w:p>
-    <w:p>
-      <w:pPr>
+        <w:t>the business</w:t>
+      </w:r>
+      <w:proofErr w:type="gramEnd"/>
+      <w:r>
         <w:rPr>
           <w:i/>
           <w:iCs/>
         </w:rPr>
-      </w:pPr>
-    </w:p>
-    <w:p>
-      <w:r>
-        <w:t>Financial advisors and retail investors often need to compare thousands of mutual funds with different performance histories, risk levels, fees, and investment requirements. The volume and complexity of available information make it difficult to evaluate funds efficiently and consistently. A structured data analysis can uncover relationships among key fund characteristics and generate insights that support more informed investment decisions.</w:t>
-      </w:r>
-    </w:p>
-    <w:p/>
-    <w:p>
-      <w:pPr>
-        <w:pStyle w:val="Heading1"/>
-      </w:pPr>
-      <w:r>
-        <w:t xml:space="preserve">Write the </w:t>
-      </w:r>
-      <w:r>
-        <w:t>P</w:t>
-      </w:r>
-      <w:r>
-        <w:t>roject objective</w:t>
-      </w:r>
-    </w:p>
-    <w:p>
-      <w:pPr>
+        <w:t xml:space="preserve">, not </w:t>
+      </w:r>
+      <w:proofErr w:type="gramStart"/>
+      <w:r>
         <w:rPr>
           <w:i/>
           <w:iCs/>
         </w:rPr>
-      </w:pPr>
+        <w:t>the data</w:t>
+      </w:r>
+      <w:proofErr w:type="gramEnd"/>
       <w:r>
         <w:rPr>
           <w:i/>
           <w:iCs/>
         </w:rPr>
-        <w:t>[</w:t>
+        <w:t>.</w:t>
       </w:r>
       <w:r>
         <w:rPr>
           <w:i/>
           <w:iCs/>
         </w:rPr>
-        <w:t>The objective should describe what the project aims to accomplish</w:t>
-      </w:r>
-      <w:r>
+        <w:t xml:space="preserve"> It defines the purpose of the project.]</w:t>
+      </w:r>
+    </w:p>
+    <w:p>
+      <w:pPr>
         <w:rPr>
           <w:i/>
           <w:iCs/>
         </w:rPr>
-        <w:t>]</w:t>
+      </w:pPr>
+    </w:p>
+    <w:p>
+      <w:r>
+        <w:t>Financial advisors and retail investors often need to compare thousands of mutual funds with different performance histories, risk levels, fees, and investment requirements. The volume and complexity of available information make it difficult to evaluate funds efficiently and consistently. A structured data analysis can uncover relationships among key fund characteristics and generate insights that support more informed investment decisions.</w:t>
+      </w:r>
+    </w:p>
+    <w:p/>
+    <w:p>
+      <w:pPr>
+        <w:pStyle w:val="Heading1"/>
+      </w:pPr>
+      <w:r>
+        <w:t xml:space="preserve">Write the </w:t>
+      </w:r>
+      <w:r>
+        <w:t>P</w:t>
+      </w:r>
+      <w:r>
+        <w:t>roject objective</w:t>
+      </w:r>
+    </w:p>
+    <w:p>
+      <w:pPr>
+        <w:rPr>
+          <w:i/>
+          <w:iCs/>
+        </w:rPr>
+      </w:pPr>
+      <w:r>
+        <w:rPr>
+          <w:i/>
+          <w:iCs/>
+        </w:rPr>
+        <w:t>[The objective should describe what the project aims to accomplish]</w:t>
       </w:r>
     </w:p>
     <w:p>
@@ -217,19 +236,33 @@
         <w:rPr>
           <w:color w:val="EE0000"/>
         </w:rPr>
-        <w:t>[Have not built it yet. When the project is complete, it should read like experience, not like an assignment. And I should add the links, for example: GitHub]</w:t>
-      </w:r>
-    </w:p>
-    <w:p>
-      <w:pPr>
+        <w:t xml:space="preserve">[Have not built it yet. When the project is complete, it should </w:t>
+      </w:r>
+      <w:proofErr w:type="gramStart"/>
+      <w:r>
         <w:rPr>
           <w:color w:val="EE0000"/>
         </w:rPr>
-      </w:pPr>
+        <w:t>read</w:t>
+      </w:r>
+      <w:proofErr w:type="gramEnd"/>
       <w:r>
         <w:rPr>
           <w:color w:val="EE0000"/>
         </w:rPr>
+        <w:t xml:space="preserve"> like experience, not like an assignment. And I should add the links, for example: GitHub]</w:t>
+      </w:r>
+    </w:p>
+    <w:p>
+      <w:pPr>
+        <w:rPr>
+          <w:color w:val="EE0000"/>
+        </w:rPr>
+      </w:pPr>
+      <w:r>
+        <w:rPr>
+          <w:color w:val="EE0000"/>
+        </w:rPr>
         <w:t xml:space="preserve">Tools: SQL, Excel, Power BI </w:t>
       </w:r>
     </w:p>
@@ -243,7 +276,21 @@
         <w:rPr>
           <w:color w:val="EE0000"/>
         </w:rPr>
-        <w:t>- Demonstrated skills: Data cleaning, KPI creation, Dashboard design, Financial reporting, Trend analysis</w:t>
+        <w:t xml:space="preserve">- Demonstrated skills: Data cleaning, KPI creation, Dashboard design, </w:t>
+      </w:r>
+      <w:proofErr w:type="gramStart"/>
+      <w:r>
+        <w:rPr>
+          <w:color w:val="EE0000"/>
+        </w:rPr>
+        <w:t>Financial</w:t>
+      </w:r>
+      <w:proofErr w:type="gramEnd"/>
+      <w:r>
+        <w:rPr>
+          <w:color w:val="EE0000"/>
+        </w:rPr>
+        <w:t xml:space="preserve"> reporting, Trend analysis</w:t>
       </w:r>
     </w:p>
     <w:p>
@@ -281,19 +328,7 @@
         <w:rPr>
           <w:color w:val="EE0000"/>
         </w:rPr>
-        <w:t>Business Problem</w:t>
-      </w:r>
-      <w:r>
-        <w:rPr>
-          <w:color w:val="EE0000"/>
-        </w:rPr>
-        <w:t xml:space="preserve"> </w:t>
-      </w:r>
-      <w:r>
-        <w:rPr>
-          <w:color w:val="EE0000"/>
-        </w:rPr>
-        <w:t>(final version)</w:t>
+        <w:t>Business Problem (final version)</w:t>
       </w:r>
     </w:p>
     <w:p>
@@ -311,19 +346,7 @@
         <w:rPr>
           <w:color w:val="EE0000"/>
         </w:rPr>
-        <w:t>Why we chose it</w:t>
-      </w:r>
-      <w:r>
-        <w:rPr>
-          <w:color w:val="EE0000"/>
-        </w:rPr>
-        <w:t xml:space="preserve"> </w:t>
-      </w:r>
-      <w:r>
-        <w:rPr>
-          <w:color w:val="EE0000"/>
-        </w:rPr>
-        <w:t>(my notes)</w:t>
+        <w:t>Why we chose it (my notes)</w:t>
       </w:r>
     </w:p>
     <w:p>
@@ -341,19 +364,7 @@
         <w:rPr>
           <w:color w:val="EE0000"/>
         </w:rPr>
-        <w:t>Alternative ideas</w:t>
-      </w:r>
-      <w:r>
-        <w:rPr>
-          <w:color w:val="EE0000"/>
-        </w:rPr>
-        <w:t xml:space="preserve"> </w:t>
-      </w:r>
-      <w:r>
-        <w:rPr>
-          <w:color w:val="EE0000"/>
-        </w:rPr>
-        <w:t>(my notes)</w:t>
+        <w:t>Alternative ideas (my notes)</w:t>
       </w:r>
     </w:p>
     <w:p>
@@ -371,19 +382,7 @@
         <w:rPr>
           <w:color w:val="EE0000"/>
         </w:rPr>
-        <w:t>Questions that came up</w:t>
-      </w:r>
-      <w:r>
-        <w:rPr>
-          <w:color w:val="EE0000"/>
-        </w:rPr>
-        <w:t xml:space="preserve"> </w:t>
-      </w:r>
-      <w:r>
-        <w:rPr>
-          <w:color w:val="EE0000"/>
-        </w:rPr>
-        <w:t>(my notes)</w:t>
+        <w:t>Questions that came up (my notes)</w:t>
       </w:r>
     </w:p>
     <w:sectPr>

</xml_diff>